<commit_message>
Update Instruction Documentation for Clarity and Consistency
- Enhanced README and instruction files to clarify the process for resetting Help text in live deployments, emphasizing the importance of syncing with the database after markdown updates.
- Updated various instruction documents to improve clarity on managing party accounts under **Sides**, ensuring that both administrators and mediators have clear guidance on user management.
- Revised content across multiple files to standardize terminology and improve the overall user experience during mediation sessions.

These changes aim to provide clearer instructions and enhance the usability of the documentation for all user roles.
</commit_message>
<xml_diff>
--- a/public/docs/en/overview.docx
+++ b/public/docs/en/overview.docx
@@ -763,7 +763,7 @@
           <w:sz w:val="22"/>
           <w:szCs w:val="22"/>
         </w:rPr>
-        <w:t xml:space="preserve"> in the header or sidebar to read these instructions, download PDF / DOCX, or ask the chat assistant.</w:t>
+        <w:t xml:space="preserve"> to read these instructions, download PDF / DOCX, or ask the chat assistant.</w:t>
       </w:r>
     </w:p>
     <w:p>
@@ -777,7 +777,7 @@
           <w:sz w:val="22"/>
           <w:szCs w:val="22"/>
         </w:rPr>
-        <w:t xml:space="preserve">Administrators and mediators manage party accounts under </w:t>
+        <w:t xml:space="preserve">Administrators and mediators manage participants under </w:t>
       </w:r>
       <w:r>
         <w:rPr>
@@ -797,7 +797,7 @@
           <w:sz w:val="22"/>
           <w:szCs w:val="22"/>
         </w:rPr>
-        <w:t xml:space="preserve"> in their consoles (see the matching instructions). Parties see their role in the header as </w:t>
+        <w:t xml:space="preserve"> (mediators: own rooms only; admins: all parties, including roomless). Parties see </w:t>
       </w:r>
       <w:r>
         <w:rPr>
@@ -837,7 +837,7 @@
           <w:sz w:val="22"/>
           <w:szCs w:val="22"/>
         </w:rPr>
-        <w:t xml:space="preserve">, often with their case title (for example </w:t>
+        <w:t xml:space="preserve"> in the header, often with a case title (for example </w:t>
       </w:r>
       <w:r>
         <w:rPr>
@@ -857,7 +857,27 @@
           <w:sz w:val="22"/>
           <w:szCs w:val="22"/>
         </w:rPr>
-        <w:t xml:space="preserve">).</w:t>
+        <w:t xml:space="preserve">), and can open </w:t>
+      </w:r>
+      <w:r>
+        <w:rPr>
+          <w:rFonts w:ascii="Calibri" w:cs="Calibri" w:eastAsia="Calibri" w:hAnsi="Calibri"/>
+          <w:b/>
+          <w:bCs/>
+          <w:color w:val="1A1A18"/>
+          <w:sz w:val="22"/>
+          <w:szCs w:val="22"/>
+        </w:rPr>
+        <w:t xml:space="preserve">My rooms</w:t>
+      </w:r>
+      <w:r>
+        <w:rPr>
+          <w:rFonts w:ascii="Calibri" w:cs="Calibri" w:eastAsia="Calibri" w:hAnsi="Calibri"/>
+          <w:color w:val="1A1A18"/>
+          <w:sz w:val="22"/>
+          <w:szCs w:val="22"/>
+        </w:rPr>
+        <w:t xml:space="preserve">.</w:t>
       </w:r>
     </w:p>
     <w:p>
@@ -1065,7 +1085,27 @@
           <w:sz w:val="22"/>
           <w:szCs w:val="22"/>
         </w:rPr>
-        <w:t xml:space="preserve"> — a confirmation page appears; click </w:t>
+        <w:t xml:space="preserve"> — in a normal browser, sign-in </w:t>
+      </w:r>
+      <w:r>
+        <w:rPr>
+          <w:rFonts w:ascii="Calibri" w:cs="Calibri" w:eastAsia="Calibri" w:hAnsi="Calibri"/>
+          <w:b/>
+          <w:bCs/>
+          <w:color w:val="1A1A18"/>
+          <w:sz w:val="22"/>
+          <w:szCs w:val="22"/>
+        </w:rPr>
+        <w:t xml:space="preserve">completes automatically</w:t>
+      </w:r>
+      <w:r>
+        <w:rPr>
+          <w:rFonts w:ascii="Calibri" w:cs="Calibri" w:eastAsia="Calibri" w:hAnsi="Calibri"/>
+          <w:color w:val="1A1A18"/>
+          <w:sz w:val="22"/>
+          <w:szCs w:val="22"/>
+        </w:rPr>
+        <w:t xml:space="preserve"> (if JavaScript is off — </w:t>
       </w:r>
       <w:r>
         <w:rPr>
@@ -1085,7 +1125,7 @@
           <w:sz w:val="22"/>
           <w:szCs w:val="22"/>
         </w:rPr>
-        <w:t xml:space="preserve"> to sign in. The link is one-time and valid for </w:t>
+        <w:t xml:space="preserve">). The link is one-time and valid for </w:t>
       </w:r>
       <w:r>
         <w:rPr>
@@ -1105,7 +1145,7 @@
           <w:sz w:val="22"/>
           <w:szCs w:val="22"/>
         </w:rPr>
-        <w:t xml:space="preserve">. After it is used, it becomes invalid.</w:t>
+        <w:t xml:space="preserve">.</w:t>
       </w:r>
     </w:p>
     <w:p>
@@ -1135,7 +1175,7 @@
           <w:sz w:val="22"/>
           <w:szCs w:val="22"/>
         </w:rPr>
-        <w:t xml:space="preserve"> An administrator (Mode A) or a mediator (Mode B) creates the account.</w:t>
+        <w:t xml:space="preserve"> An administrator (Mode A) or a mediator (Mode B) creates the account. A Magic Link can be generated by an admin or by a mediator (for parties in their rooms).</w:t>
       </w:r>
     </w:p>
     <w:p>
@@ -1214,7 +1254,27 @@
           <w:sz w:val="22"/>
           <w:szCs w:val="22"/>
         </w:rPr>
-        <w:t xml:space="preserve">Ask the Help assistant about waits, Sides, schedule, or Mode A/B if you need a quick answer from these texts.</w:t>
+        <w:t xml:space="preserve">Ask the Help assistant about waits (toasters), </w:t>
+      </w:r>
+      <w:r>
+        <w:rPr>
+          <w:rFonts w:ascii="Calibri" w:cs="Calibri" w:eastAsia="Calibri" w:hAnsi="Calibri"/>
+          <w:b/>
+          <w:bCs/>
+          <w:color w:val="1A1A18"/>
+          <w:sz w:val="22"/>
+          <w:szCs w:val="22"/>
+        </w:rPr>
+        <w:t xml:space="preserve">Sides</w:t>
+      </w:r>
+      <w:r>
+        <w:rPr>
+          <w:rFonts w:ascii="Calibri" w:cs="Calibri" w:eastAsia="Calibri" w:hAnsi="Calibri"/>
+          <w:color w:val="1A1A18"/>
+          <w:sz w:val="22"/>
+          <w:szCs w:val="22"/>
+        </w:rPr>
+        <w:t xml:space="preserve">, schedule, or Mode A/B.</w:t>
       </w:r>
     </w:p>
     <w:p>
@@ -1277,27 +1337,47 @@
           <w:sz w:val="22"/>
           <w:szCs w:val="22"/>
         </w:rPr>
-        <w:t xml:space="preserve">Mediators and administrators have separate consoles for rooms, </w:t>
-      </w:r>
-      <w:r>
-        <w:rPr>
-          <w:rFonts w:ascii="Calibri" w:cs="Calibri" w:eastAsia="Calibri" w:hAnsi="Calibri"/>
-          <w:b/>
-          <w:bCs/>
-          <w:color w:val="1A1A18"/>
-          <w:sz w:val="22"/>
-          <w:szCs w:val="22"/>
-        </w:rPr>
-        <w:t xml:space="preserve">Sides</w:t>
-      </w:r>
-      <w:r>
-        <w:rPr>
-          <w:rFonts w:ascii="Calibri" w:cs="Calibri" w:eastAsia="Calibri" w:hAnsi="Calibri"/>
-          <w:color w:val="1A1A18"/>
-          <w:sz w:val="22"/>
-          <w:szCs w:val="22"/>
-        </w:rPr>
-        <w:t xml:space="preserve">, scheduling, and platform settings — see the matching instructions.</w:t>
+        <w:t xml:space="preserve">Details of buttons, timers (Mode A: </w:t>
+      </w:r>
+      <w:r>
+        <w:rPr>
+          <w:rFonts w:ascii="Calibri" w:cs="Calibri" w:eastAsia="Calibri" w:hAnsi="Calibri"/>
+          <w:b/>
+          <w:bCs/>
+          <w:color w:val="1A1A18"/>
+          <w:sz w:val="22"/>
+          <w:szCs w:val="22"/>
+        </w:rPr>
+        <w:t xml:space="preserve">120 min</w:t>
+      </w:r>
+      <w:r>
+        <w:rPr>
+          <w:rFonts w:ascii="Calibri" w:cs="Calibri" w:eastAsia="Calibri" w:hAnsi="Calibri"/>
+          <w:color w:val="1A1A18"/>
+          <w:sz w:val="22"/>
+          <w:szCs w:val="22"/>
+        </w:rPr>
+        <w:t xml:space="preserve">, reply time </w:t>
+      </w:r>
+      <w:r>
+        <w:rPr>
+          <w:rFonts w:ascii="Calibri" w:cs="Calibri" w:eastAsia="Calibri" w:hAnsi="Calibri"/>
+          <w:b/>
+          <w:bCs/>
+          <w:color w:val="1A1A18"/>
+          <w:sz w:val="22"/>
+          <w:szCs w:val="22"/>
+        </w:rPr>
+        <w:t xml:space="preserve">15 min</w:t>
+      </w:r>
+      <w:r>
+        <w:rPr>
+          <w:rFonts w:ascii="Calibri" w:cs="Calibri" w:eastAsia="Calibri" w:hAnsi="Calibri"/>
+          <w:color w:val="1A1A18"/>
+          <w:sz w:val="22"/>
+          <w:szCs w:val="22"/>
+        </w:rPr>
+        <w:t xml:space="preserve">), and toasters are in parties.md. Mediators and administrators have separate consoles — see the matching instructions.</w:t>
       </w:r>
     </w:p>
     <w:sectPr>

</xml_diff>